<commit_message>
Docx writer: initialize envLang from `lang` metadata.
This ensures that setting `lang` will affect the whole document.
Previously, setting `lang` to `he` was not sufficient to make
the document RTL.

See #11301.
</commit_message>
<xml_diff>
--- a/test/docx/golden/document-properties.docx
+++ b/test/docx/golden/document-properties.docx
@@ -7,6 +7,9 @@
         <w:pStyle w:val="Title"/>
       </w:pPr>
       <w:r>
+        <w:rPr>
+          <w:lang w:val="en-US"/>
+        </w:rPr>
         <w:t xml:space="preserve">Testing custom properties</w:t>
       </w:r>
     </w:p>
@@ -15,6 +18,9 @@
         <w:pStyle w:val="Subtitle"/>
       </w:pPr>
       <w:r>
+        <w:rPr>
+          <w:lang w:val="en-US"/>
+        </w:rPr>
         <w:t xml:space="preserve">This is a subtitle</w:t>
       </w:r>
     </w:p>
@@ -23,6 +29,9 @@
         <w:pStyle w:val="Author"/>
       </w:pPr>
       <w:r>
+        <w:rPr>
+          <w:lang w:val="en-US"/>
+        </w:rPr>
         <w:t xml:space="preserve">A. M.</w:t>
       </w:r>
     </w:p>
@@ -39,12 +48,21 @@
         <w:pStyle w:val="Abstract"/>
       </w:pPr>
       <w:r>
+        <w:rPr>
+          <w:lang w:val="en-US"/>
+        </w:rPr>
         <w:t xml:space="preserve">Quite a long description</w:t>
       </w:r>
       <w:r>
+        <w:rPr>
+          <w:lang w:val="en-US"/>
+        </w:rPr>
         <w:t xml:space="preserve"> </w:t>
       </w:r>
       <w:r>
+        <w:rPr>
+          <w:lang w:val="en-US"/>
+        </w:rPr>
         <w:t xml:space="preserve">spanning several lines</w:t>
       </w:r>
     </w:p>
@@ -53,6 +71,9 @@
         <w:pStyle w:val="FirstParagraph"/>
       </w:pPr>
       <w:r>
+        <w:rPr>
+          <w:lang w:val="en-US"/>
+        </w:rPr>
         <w:t xml:space="preserve">Testing document properties</w:t>
       </w:r>
     </w:p>

</xml_diff>